<commit_message>
Release V1.20 with Google Calendar import and Drive backup restore
</commit_message>
<xml_diff>
--- a/app/public/USER-MANUAL.en.docx
+++ b/app/public/USER-MANUAL.en.docx
@@ -7,7 +7,7 @@
         <w:pStyle w:val="Title"/>
       </w:pPr>
       <w:r>
-        <w:t>Time Audit User Guide (V1.16)</w:t>
+        <w:t>Time Audit User Guide (V1.20)</w:t>
       </w:r>
     </w:p>
     <w:p>
@@ -90,7 +90,38 @@
         <w:pStyle w:val="Heading1"/>
       </w:pPr>
       <w:r>
-        <w:t>3. Keep a daily journal</w:t>
+        <w:t>3. Import from Google Calendar</w:t>
+      </w:r>
+    </w:p>
+    <w:p>
+      <w:r>
+        <w:t xml:space="preserve">In Calendar, choose </w:t>
+      </w:r>
+      <w:r>
+        <w:rPr>
+          <w:b/>
+        </w:rPr>
+        <w:t>Import Google Calendar</w:t>
+      </w:r>
+      <w:r>
+        <w:t xml:space="preserve">, select up to 31 days, and click </w:t>
+      </w:r>
+      <w:r>
+        <w:rPr>
+          <w:b/>
+        </w:rPr>
+        <w:t>Authorize &amp; preview</w:t>
+      </w:r>
+      <w:r>
+        <w:t>. Calendar permission is separate from sign-in and Drive access. The preview reads timed events from your primary calendar, skipping all-day and previously imported events. Edit the title, activity, start/end times, and selection for each event; overlapping events start unchecked. Imported events become editable Time Audit entries and never change Google Calendar. Import only activities that actually occurred, then add ratings if useful.</w:t>
+      </w:r>
+    </w:p>
+    <w:p>
+      <w:pPr>
+        <w:pStyle w:val="Heading1"/>
+      </w:pPr>
+      <w:r>
+        <w:t>4. Keep a daily journal</w:t>
       </w:r>
     </w:p>
     <w:p>
@@ -103,7 +134,7 @@
         <w:pStyle w:val="Heading1"/>
       </w:pPr>
       <w:r>
-        <w:t>4. Read insights</w:t>
+        <w:t>5. Read insights</w:t>
       </w:r>
     </w:p>
     <w:p>
@@ -114,10 +145,9 @@
     <w:p>
       <w:pPr>
         <w:pStyle w:val="Heading1"/>
-        <w:pageBreakBefore/>
       </w:pPr>
       <w:r>
-        <w:t>5. Turn reflection into action</w:t>
+        <w:t>6. Turn reflection into action</w:t>
       </w:r>
     </w:p>
     <w:p>
@@ -130,12 +160,21 @@
         <w:pStyle w:val="Heading1"/>
       </w:pPr>
       <w:r>
-        <w:t>6. Sync, backup, and privacy</w:t>
+        <w:t>7. Sync, backup, and privacy</w:t>
       </w:r>
     </w:p>
     <w:p>
       <w:r>
-        <w:t>After Drive authorization, use the top-bar sync button and watch its progress. Make sure both devices sync before switching. Export a JSON backup in Settings before changing devices or making major edits; CSV supports spreadsheet analysis, and JSON import is available. Settings also includes language, font/sidebar size, reminders while the browser is open, activity category management, optional IPIP-50, and update checks.</w:t>
+        <w:t xml:space="preserve">After Drive authorization, use the top-bar sync button and watch its progress. Make sure both devices sync before switching. In </w:t>
+      </w:r>
+      <w:r>
+        <w:rPr>
+          <w:b/>
+        </w:rPr>
+        <w:t>Settings → Backup &amp; restore</w:t>
+      </w:r>
+      <w:r>
+        <w:t>, sync first and create an independent JSON copy in your Google Drive. You can inspect a copy before restoring it; the current Drive files are archived first. Update other devices to V1.20 before syncing after a restore. You can also download JSON or CSV locally and import JSON. Settings also includes language, font/sidebar size, reminders while the browser is open, activity category management, optional IPIP-50, and update checks.</w:t>
       </w:r>
     </w:p>
     <w:p>
@@ -174,7 +213,7 @@
         <w:color w:val="5F7787"/>
         <w:sz w:val="16"/>
       </w:rPr>
-      <w:t xml:space="preserve">V1.16  ·  </w:t>
+      <w:t xml:space="preserve">V1.20  ·  </w:t>
     </w:r>
     <w:fldSimple w:instr="PAGE"/>
   </w:p>

</xml_diff>

<commit_message>
Withdraw Google Calendar import pending domain verification
</commit_message>
<xml_diff>
--- a/app/public/USER-MANUAL.en.docx
+++ b/app/public/USER-MANUAL.en.docx
@@ -7,7 +7,7 @@
         <w:pStyle w:val="Title"/>
       </w:pPr>
       <w:r>
-        <w:t>Time Audit User Guide (V1.20)</w:t>
+        <w:t>Time Audit User Guide (V1.20.1)</w:t>
       </w:r>
     </w:p>
     <w:p>
@@ -90,38 +90,7 @@
         <w:pStyle w:val="Heading1"/>
       </w:pPr>
       <w:r>
-        <w:t>3. Import from Google Calendar</w:t>
-      </w:r>
-    </w:p>
-    <w:p>
-      <w:r>
-        <w:t xml:space="preserve">In Calendar, choose </w:t>
-      </w:r>
-      <w:r>
-        <w:rPr>
-          <w:b/>
-        </w:rPr>
-        <w:t>Import Google Calendar</w:t>
-      </w:r>
-      <w:r>
-        <w:t xml:space="preserve">, select up to 31 days, and click </w:t>
-      </w:r>
-      <w:r>
-        <w:rPr>
-          <w:b/>
-        </w:rPr>
-        <w:t>Authorize &amp; preview</w:t>
-      </w:r>
-      <w:r>
-        <w:t>. Calendar permission is separate from sign-in and Drive access. The preview reads timed events from your primary calendar, skipping all-day and previously imported events. Edit the title, activity, start/end times, and selection for each event; overlapping events start unchecked. Imported events become editable Time Audit entries and never change Google Calendar. Import only activities that actually occurred, then add ratings if useful.</w:t>
-      </w:r>
-    </w:p>
-    <w:p>
-      <w:pPr>
-        <w:pStyle w:val="Heading1"/>
-      </w:pPr>
-      <w:r>
-        <w:t>4. Keep a daily journal</w:t>
+        <w:t>3. Keep a daily journal</w:t>
       </w:r>
     </w:p>
     <w:p>
@@ -134,7 +103,7 @@
         <w:pStyle w:val="Heading1"/>
       </w:pPr>
       <w:r>
-        <w:t>5. Read insights</w:t>
+        <w:t>3. Read insights</w:t>
       </w:r>
     </w:p>
     <w:p>
@@ -147,7 +116,7 @@
         <w:pStyle w:val="Heading1"/>
       </w:pPr>
       <w:r>
-        <w:t>6. Turn reflection into action</w:t>
+        <w:t>3. Turn reflection into action</w:t>
       </w:r>
     </w:p>
     <w:p>
@@ -160,7 +129,7 @@
         <w:pStyle w:val="Heading1"/>
       </w:pPr>
       <w:r>
-        <w:t>7. Sync, backup, and privacy</w:t>
+        <w:t>3. Sync, backup, and privacy</w:t>
       </w:r>
     </w:p>
     <w:p>
@@ -174,7 +143,7 @@
         <w:t>Settings → Backup &amp; restore</w:t>
       </w:r>
       <w:r>
-        <w:t>, sync first and create an independent JSON copy in your Google Drive. You can inspect a copy before restoring it; the current Drive files are archived first. Update other devices to V1.20 before syncing after a restore. You can also download JSON or CSV locally and import JSON. Settings also includes language, font/sidebar size, reminders while the browser is open, activity category management, optional IPIP-50, and update checks.</w:t>
+        <w:t>, sync first and create an independent JSON copy in your Google Drive. You can inspect a copy before restoring it; the current Drive files are archived first. Update other devices to V1.20.1 before syncing after a restore. You can also download JSON or CSV locally and import JSON. Settings also includes language, font/sidebar size, reminders while the browser is open, activity category management, optional IPIP-50, and update checks.</w:t>
       </w:r>
     </w:p>
     <w:p>
@@ -213,7 +182,7 @@
         <w:color w:val="5F7787"/>
         <w:sz w:val="16"/>
       </w:rPr>
-      <w:t xml:space="preserve">V1.20  ·  </w:t>
+      <w:t xml:space="preserve">V1.20.1  ·  </w:t>
     </w:r>
     <w:fldSimple w:instr="PAGE"/>
   </w:p>

</xml_diff>

<commit_message>
Correct chapter numbering in V1.20.1 manuals
</commit_message>
<xml_diff>
--- a/app/public/USER-MANUAL.en.docx
+++ b/app/public/USER-MANUAL.en.docx
@@ -103,7 +103,7 @@
         <w:pStyle w:val="Heading1"/>
       </w:pPr>
       <w:r>
-        <w:t>3. Read insights</w:t>
+        <w:t>4. Read insights</w:t>
       </w:r>
     </w:p>
     <w:p>
@@ -116,7 +116,7 @@
         <w:pStyle w:val="Heading1"/>
       </w:pPr>
       <w:r>
-        <w:t>3. Turn reflection into action</w:t>
+        <w:t>5. Turn reflection into action</w:t>
       </w:r>
     </w:p>
     <w:p>
@@ -129,7 +129,7 @@
         <w:pStyle w:val="Heading1"/>
       </w:pPr>
       <w:r>
-        <w:t>3. Sync, backup, and privacy</w:t>
+        <w:t>6. Sync, backup, and privacy</w:t>
       </w:r>
     </w:p>
     <w:p>

</xml_diff>

<commit_message>
Release V1.21 personal finance activities
</commit_message>
<xml_diff>
--- a/app/public/USER-MANUAL.en.docx
+++ b/app/public/USER-MANUAL.en.docx
@@ -7,7 +7,7 @@
         <w:pStyle w:val="Title"/>
       </w:pPr>
       <w:r>
-        <w:t>Time Audit User Guide (V1.20.1)</w:t>
+        <w:t>Time Audit User Guide (V1.21)</w:t>
       </w:r>
     </w:p>
     <w:p>
@@ -86,6 +86,11 @@
       </w:r>
     </w:p>
     <w:p>
+      <w:r>
+        <w:t>Personal finance includes budgeting / bookkeeping, banking / post office, investing / market review, currency exchange / foreign funds, and insurance / taxes. Use General finances when a task does not fit one group. Existing custom “理財” entries move into this category while retaining their activity IDs and records.</w:t>
+      </w:r>
+    </w:p>
+    <w:p>
       <w:pPr>
         <w:pStyle w:val="Heading1"/>
       </w:pPr>
@@ -143,7 +148,7 @@
         <w:t>Settings → Backup &amp; restore</w:t>
       </w:r>
       <w:r>
-        <w:t>, sync first and create an independent JSON copy in your Google Drive. You can inspect a copy before restoring it; the current Drive files are archived first. Update other devices to V1.20.1 before syncing after a restore. You can also download JSON or CSV locally and import JSON. Settings also includes language, font/sidebar size, reminders while the browser is open, activity category management, optional IPIP-50, and update checks.</w:t>
+        <w:t>, sync first and create an independent JSON copy in your Google Drive. You can inspect a copy before restoring it; the current Drive files are archived first. Update other devices to V1.21 before syncing after a restore. You can also download JSON or CSV locally and import JSON. Settings also includes language, font/sidebar size, reminders while the browser is open, activity category management, optional IPIP-50, and update checks.</w:t>
       </w:r>
     </w:p>
     <w:p>

</xml_diff>

<commit_message>
Release V1.25 with smoother time backfill
</commit_message>
<xml_diff>
--- a/app/public/USER-MANUAL.en.docx
+++ b/app/public/USER-MANUAL.en.docx
@@ -7,7 +7,7 @@
         <w:pStyle w:val="Title"/>
       </w:pPr>
       <w:r>
-        <w:t>Time Audit User Guide (V1.21)</w:t>
+        <w:t>Time Audit User Guide (V1.25)</w:t>
       </w:r>
     </w:p>
     <w:p>
@@ -87,6 +87,11 @@
     </w:p>
     <w:p>
       <w:r>
+        <w:t>When you select an unrecorded gap on an earlier date, the form starts at that gap and suggests an end one reminder interval later, without passing the gap's end. You can still choose any valid duration. If you change the start of a new entry before manually editing its end, the end moves with it and preserves the duration.</w:t>
+      </w:r>
+    </w:p>
+    <w:p>
+      <w:r>
         <w:t>Personal finance includes budgeting / bookkeeping, banking / post office, investing / market review, currency exchange / foreign funds, and insurance / taxes. Use General finances when a task does not fit one group. Existing custom “理財” entries move into this category while retaining their activity IDs and records.</w:t>
       </w:r>
     </w:p>
@@ -148,7 +153,7 @@
         <w:t>Settings → Backup &amp; restore</w:t>
       </w:r>
       <w:r>
-        <w:t>, sync first and create an independent JSON copy in your Google Drive. You can inspect a copy before restoring it; the current Drive files are archived first. Update other devices to V1.21 before syncing after a restore. You can also download JSON or CSV locally and import JSON. Settings also includes language, font/sidebar size, reminders while the browser is open, activity category management, optional IPIP-50, and update checks.</w:t>
+        <w:t>, sync first and create an independent JSON copy in your Google Drive. You can inspect a copy before restoring it; the current Drive files are archived first. Update other devices to V1.25 before syncing after a restore. You can also download JSON or CSV locally and import JSON. Settings also includes language, font/sidebar size, reminders while the browser is open, activity category management, optional IPIP-50, and update checks.</w:t>
       </w:r>
     </w:p>
     <w:p>

</xml_diff>

<commit_message>
Release V1.25.1 with QR sharing in Settings
</commit_message>
<xml_diff>
--- a/app/public/USER-MANUAL.en.docx
+++ b/app/public/USER-MANUAL.en.docx
@@ -7,7 +7,7 @@
         <w:pStyle w:val="Title"/>
       </w:pPr>
       <w:r>
-        <w:t>Time Audit User Guide (V1.25)</w:t>
+        <w:t>Time Audit User Guide (V1.25.1)</w:t>
       </w:r>
     </w:p>
     <w:p>
@@ -153,7 +153,21 @@
         <w:t>Settings → Backup &amp; restore</w:t>
       </w:r>
       <w:r>
-        <w:t>, sync first and create an independent JSON copy in your Google Drive. You can inspect a copy before restoring it; the current Drive files are archived first. Update other devices to V1.25 before syncing after a restore. You can also download JSON or CSV locally and import JSON. Settings also includes language, font/sidebar size, reminders while the browser is open, activity category management, optional IPIP-50, and update checks.</w:t>
+        <w:t>, sync first and create an independent JSON copy in your Google Drive. You can inspect a copy before restoring it; the current Drive files are archived first. Update other devices to V1.25.1 before syncing after a restore. You can also download JSON or CSV locally and import JSON. Settings also includes language, font/sidebar size, reminders while the browser is open, activity category management, optional IPIP-50, and update checks.</w:t>
+      </w:r>
+    </w:p>
+    <w:p>
+      <w:r>
+        <w:t xml:space="preserve">To introduce Time Audit to someone, open </w:t>
+      </w:r>
+      <w:r>
+        <w:rPr>
+          <w:b/>
+        </w:rPr>
+        <w:t>Settings → Share Time Audit</w:t>
+      </w:r>
+      <w:r>
+        <w:t xml:space="preserve"> and show the QR code. Tap it to enlarge, copy the site link, or download the image. The shared link contains none of your personal entries.</w:t>
       </w:r>
     </w:p>
     <w:p>

</xml_diff>